<commit_message>
feat: implement OAuth login and book library
</commit_message>
<xml_diff>
--- a/docs/api/MEKOBOOK_API_DOCUMENTATION.docx
+++ b/docs/api/MEKOBOOK_API_DOCUMENTATION.docx
@@ -44,7 +44,7 @@
           <w:color w:val="4B5563"/>
           <w:sz w:val="19"/>
         </w:rPr>
-        <w:t>Liferay 7.4 GA132 CE Headless REST APIs | Base URL: http://localhost:8080 | Client ID: mekobook-mobile-client | Client Secret: mekobook-mobile-secret</w:t>
+        <w:t>Liferay 7.4 GA132 CE Headless REST APIs | Base URL: https://serrated-catacomb-vendor.ngrok-free.dev | Client ID: mekobook-mobile-client | Client Secret: mekobook-mobile-secret</w:t>
       </w:r>
     </w:p>
     <w:p>
@@ -1085,7 +1085,7 @@
                 <w:color w:val="475569"/>
                 <w:sz w:val="14"/>
               </w:rPr>
-              <w:t>http://localhost:8080/o/oauth2/token</w:t>
+              <w:t>https://serrated-catacomb-vendor.ngrok-free.dev/o/oauth2/token</w:t>
             </w:r>
           </w:p>
         </w:tc>
@@ -1462,7 +1462,7 @@
                 <w:color w:val="475569"/>
                 <w:sz w:val="14"/>
               </w:rPr>
-              <w:t>http://localhost:8080/o/headless-admin-user/v1.0/my-user-account</w:t>
+              <w:t>https://serrated-catacomb-vendor.ngrok-free.dev/o/headless-admin-user/v1.0/my-user-account</w:t>
             </w:r>
           </w:p>
         </w:tc>
@@ -1856,7 +1856,7 @@
                 <w:color w:val="475569"/>
                 <w:sz w:val="14"/>
               </w:rPr>
-              <w:t>http://localhost:8080/o/c/books?page=1&amp;pageSize=20</w:t>
+              <w:t>https://serrated-catacomb-vendor.ngrok-free.dev/o/c/books?page=1&amp;pageSize=20</w:t>
             </w:r>
           </w:p>
         </w:tc>
@@ -1899,9 +1899,9 @@
               <w:br/>
               <w:t xml:space="preserve">      "isbn": "978-604-919-890-1",</w:t>
               <w:br/>
-              <w:t xml:space="preserve">      "coverUrl": "http://localhost:8080/documents/20117/33052/covers/ctupress-csdl-cover.jpg",</w:t>
+              <w:t xml:space="preserve">      "coverUrl": "https://serrated-catacomb-vendor.ngrok-free.dev/documents/20117/33052/covers/ctupress-csdl-cover.jpg",</w:t>
               <w:br/>
-              <w:t xml:space="preserve">      "flipbookBaseUrl": "http://localhost:8080/documents/20117/33056/flipbooks/giao-trinh-cau-truc-du-lieu-gt101/files/",</w:t>
+              <w:t xml:space="preserve">      "flipbookBaseUrl": "https://serrated-catacomb-vendor.ngrok-free.dev/documents/20117/33056/flipbooks/giao-trinh-cau-truc-du-lieu-gt101/files/",</w:t>
               <w:br/>
               <w:t xml:space="preserve">      "screenPattern": "mobile/{page}.jpg",</w:t>
               <w:br/>
@@ -2308,7 +2308,7 @@
                 <w:color w:val="475569"/>
                 <w:sz w:val="14"/>
               </w:rPr>
-              <w:t>http://localhost:8080/o/c/books/33048</w:t>
+              <w:t>https://serrated-catacomb-vendor.ngrok-free.dev/o/c/books/33048</w:t>
             </w:r>
           </w:p>
         </w:tc>
@@ -2347,7 +2347,7 @@
               <w:br/>
               <w:t xml:space="preserve">  "totalPages": 286,</w:t>
               <w:br/>
-              <w:t xml:space="preserve">  "flipbookBaseUrl": "http://localhost:8080/documents/20117/33056/flipbooks/giao-trinh-cau-truc-du-lieu-gt101/files/",</w:t>
+              <w:t xml:space="preserve">  "flipbookBaseUrl": "https://serrated-catacomb-vendor.ngrok-free.dev/documents/20117/33056/flipbooks/giao-trinh-cau-truc-du-lieu-gt101/files/",</w:t>
               <w:br/>
               <w:t xml:space="preserve">  "screenPattern": "mobile/{page}.jpg",</w:t>
               <w:br/>
@@ -2741,7 +2741,7 @@
                 <w:color w:val="475569"/>
                 <w:sz w:val="14"/>
               </w:rPr>
-              <w:t>http://localhost:8080/o/c/chaptertocs?filter=bookId%20eq%2033048&amp;sort=displayOrder:asc</w:t>
+              <w:t>https://serrated-catacomb-vendor.ngrok-free.dev/o/c/chaptertocs?filter=bookId%20eq%2033048&amp;sort=displayOrder:asc</w:t>
             </w:r>
           </w:p>
         </w:tc>
@@ -3165,7 +3165,7 @@
                 <w:color w:val="475569"/>
                 <w:sz w:val="14"/>
               </w:rPr>
-              <w:t>http://localhost:8080/o/c/personalshelfs?sort=displayOrder:asc</w:t>
+              <w:t>https://serrated-catacomb-vendor.ngrok-free.dev/o/c/personalshelfs?sort=displayOrder:asc</w:t>
             </w:r>
           </w:p>
         </w:tc>
@@ -3524,7 +3524,7 @@
                 <w:color w:val="475569"/>
                 <w:sz w:val="14"/>
               </w:rPr>
-              <w:t>http://localhost:8080/o/c/personalshelfs/</w:t>
+              <w:t>https://serrated-catacomb-vendor.ngrok-free.dev/o/c/personalshelfs/</w:t>
             </w:r>
           </w:p>
           <w:p>
@@ -3961,7 +3961,7 @@
                 <w:color w:val="475569"/>
                 <w:sz w:val="14"/>
               </w:rPr>
-              <w:t>http://localhost:8080/o/c/personalshelfs/33080</w:t>
+              <w:t>https://serrated-catacomb-vendor.ngrok-free.dev/o/c/personalshelfs/33080</w:t>
             </w:r>
           </w:p>
           <w:p>
@@ -4331,7 +4331,7 @@
                 <w:color w:val="475569"/>
                 <w:sz w:val="14"/>
               </w:rPr>
-              <w:t>http://localhost:8080/o/c/shelfitems/</w:t>
+              <w:t>https://serrated-catacomb-vendor.ngrok-free.dev/o/c/shelfitems/</w:t>
             </w:r>
           </w:p>
           <w:p>
@@ -4688,7 +4688,7 @@
                 <w:color w:val="475569"/>
                 <w:sz w:val="14"/>
               </w:rPr>
-              <w:t>http://localhost:8080/o/c/userpreferences</w:t>
+              <w:t>https://serrated-catacomb-vendor.ngrok-free.dev/o/c/userpreferences</w:t>
             </w:r>
           </w:p>
         </w:tc>
@@ -5081,7 +5081,7 @@
                 <w:color w:val="475569"/>
                 <w:sz w:val="14"/>
               </w:rPr>
-              <w:t>http://localhost:8080/o/c/readingprogresses?filter=bookId%20eq%2033048</w:t>
+              <w:t>https://serrated-catacomb-vendor.ngrok-free.dev/o/c/readingprogresses?filter=bookId%20eq%2033048</w:t>
             </w:r>
           </w:p>
         </w:tc>
@@ -5445,7 +5445,7 @@
                 <w:color w:val="475569"/>
                 <w:sz w:val="14"/>
               </w:rPr>
-              <w:t>http://localhost:8080/o/c/bookmarks?filter=bookId%20eq%2033048</w:t>
+              <w:t>https://serrated-catacomb-vendor.ngrok-free.dev/o/c/bookmarks?filter=bookId%20eq%2033048</w:t>
             </w:r>
           </w:p>
         </w:tc>
@@ -5809,7 +5809,7 @@
                 <w:color w:val="475569"/>
                 <w:sz w:val="14"/>
               </w:rPr>
-              <w:t>http://localhost:8080/o/c/annotations?filter=bookId%20eq%2033048</w:t>
+              <w:t>https://serrated-catacomb-vendor.ngrok-free.dev/o/c/annotations?filter=bookId%20eq%2033048</w:t>
             </w:r>
           </w:p>
         </w:tc>
@@ -6177,7 +6177,7 @@
                 <w:color w:val="475569"/>
                 <w:sz w:val="14"/>
               </w:rPr>
-              <w:t>http://localhost:8080/o/c/drmlicenses?filter=bookId%20eq%2033048</w:t>
+              <w:t>https://serrated-catacomb-vendor.ngrok-free.dev/o/c/drmlicenses?filter=bookId%20eq%2033048</w:t>
             </w:r>
           </w:p>
         </w:tc>
@@ -6571,7 +6571,7 @@
                 <w:color w:val="475569"/>
                 <w:sz w:val="14"/>
               </w:rPr>
-              <w:t>http://localhost:8080/o/c/deviceregistrations</w:t>
+              <w:t>https://serrated-catacomb-vendor.ngrok-free.dev/o/c/deviceregistrations</w:t>
             </w:r>
           </w:p>
         </w:tc>

</xml_diff>